<commit_message>
docs(04): el 8.2 anota que passwordHash es string | null y que el ingreso nunca le pasa un nulo a Argon2
</commit_message>
<xml_diff>
--- a/docs/04 - Decisiones tecnicas y stack.docx
+++ b/docs/04 - Decisiones tecnicas y stack.docx
@@ -4707,6 +4707,11 @@
       <w:pPr/>
       <w:r>
         <w:t>Un usuario PENDIENTE existe y no tiene contraseña: password_hash es nulo hasta que consume su enlace de activación. El documento 02 §3.2 le da su propio aviso, y ese aviso revela que el correo existe. Es una concesión aceptada y conviene que quede escrita: la indistinguibilidad cubre «el correo no existe» y «existe con contraseña incorrecta», no «existe y está pendiente».</w:t>
+      </w:r>
+    </w:p>
+    <w:p>
+      <w:r>
+        <w:t xml:space="preserve">En el código eso se ve en el tipo: UsuarioAutenticado.passwordHash es string | null, no string, para que el compilador obligue a tratar el caso. El ingreso no le pasa nunca un nulo a Argon2: un hash nulo es «pendiente» y responde con el aviso de la §3.2. La corrección es del 1 de octubre de 2026; antes el tipo decía string y mentía sobre la columna.</w:t>
       </w:r>
     </w:p>
     <w:p>

</xml_diff>

<commit_message>
feat(web): interfaz de la 6.1, contrato de la API (borrador 4), .env.example y documento 04 al dia
Contenido escrito y verificado por el otro asistente, no por quien hace
este commit: la carpeta web/ completa (pantallas, CONTRATO.md, DISENO.md),
.env.example con las cinco variables sin valor y el documento 04 con el
8.4, el 8.6 y la regla de mutar una defensa a la vez. Se commitea desde
esta terminal porque la suya no logra borrar .git/index.lock.
</commit_message>
<xml_diff>
--- a/docs/04 - Decisiones tecnicas y stack.docx
+++ b/docs/04 - Decisiones tecnicas y stack.docx
@@ -4444,7 +4444,7 @@
                 <w:szCs w:val="18"/>
                 <w:lang w:val="es-CO"/>
               </w:rPr>
-              <w:t>Contra una base de datos real. El esquema defiende las reglas con triggers, así que una prueba con base simulada puede pasar en verde mientras el sistema real rechaza la operación.</w:t>
+              <w:t>Contra una base de datos real. El esquema defiende las reglas con triggers, así que una prueba con base simulada puede pasar en verde mientras el sistema real rechaza la operación. Y para comprobar que una prueba detecta lo que dice detectar, se quita a propósito una defensa del código y se mira qué prueba cae. SE QUITA UNA A LA VEZ: con varias quitadas juntas, unas tapan a otras. En la rebanada 6.1, sin la comparación del sello y sin el rehash al mismo tiempo, la prueba del rehash seguía pasando porque ninguna cookie vieja fallaba. Un rojo con varias defensas quitadas no demuestra nada sobre cada una.</w:t>
             </w:r>
           </w:p>
         </w:tc>
@@ -4999,6 +4999,12 @@
       </w:r>
     </w:p>
     <w:p>
+      <w:pPr/>
+      <w:r>
+        <w:t>Lo que esta tabla todavía no distingue: «el dato que mandaste no sirve» y «el mundo cambió debajo tuyo». Los rechazos de negocio de la base salen todos con el mismo SQLSTATE, así que «el presupuesto ya no está Abierto» —que ocurre cuando alguien lo activó en otra pestaña— llega a la interfaz como un 422 igual que una cantidad negativa, y la pantalla marca un campo que no tiene nada de malo en vez de recargar. Separarlos pide un SQLSTATE propio para el estado, o sea un cambio de esquema. Hasta que exista, la interfaz distingue por si el error trae el nombre de un campo o no.</w:t>
+      </w:r>
+    </w:p>
+    <w:p>
       <w:pPr>
         <w:pStyle w:val="Ttulo2"/>
       </w:pPr>
@@ -5009,13 +5015,51 @@
     <w:p>
       <w:pPr/>
       <w:r>
-        <w:t>El límite de intentos de ingreso que pide la sección 5 de este documento no existe. Llega con el ingreso, o sea en la rebanada 6.1, y hasta entonces nada impide probar contraseñas en serie: argon2id hace lenta cada prueba, no imposible la serie.</w:t>
+        <w:t>El propósito RESTABLECIMIENTO de los tokens —el enlace que genera el administrador de la empresa, o el dueño, y que se entrega a mano; 24 horas de vigencia y una columna emitido_por— está aprobado de diseño y no está en el esquema, porque el documento 02 todavía no describe esa pantalla. emitido_por no será exclusiva de ese propósito: ACTIVACION también la emite una persona. Mientras no entre, un usuario que olvida su contraseña depende del dueño, que genera un token de RECUPERACION y lo entrega; ese vive 30 minutos, que para un envío a mano es apretado.</w:t>
+      </w:r>
+    </w:p>
+    <w:p>
+      <w:pPr>
+        <w:pStyle w:val="Ttulo2"/>
+      </w:pPr>
+      <w:r>
+        <w:t>8.6 Detalles de la rebanada 6.1</w:t>
       </w:r>
     </w:p>
     <w:p>
       <w:pPr/>
       <w:r>
-        <w:t>El propósito RESTABLECIMIENTO de los tokens —el enlace que genera el administrador de la empresa, o el dueño, y que se entrega a mano; 24 horas de vigencia y una columna emitido_por— está aprobado de diseño y no está en el esquema, porque el documento 02 todavía no describe esa pantalla. emitido_por no será exclusiva de ese propósito: ACTIVACION también la emite una persona. Mientras no entre, un usuario que olvida su contraseña depende del dueño, que genera un token de RECUPERACION y lo entrega; ese vive 30 minutos, que para un envío a mano es apretado.</w:t>
+        <w:t>Límite de intentos. Cinco fallos por correo y veinte por IP dentro de quince minutos en el ingreso, y diez enlaces inválidos por IP en la ruta que los consume. El bloqueo se mira ANTES de verificar la contraseña, así que mientras dura ni la correcta abre: si abriera, el bloqueo no frenaría nada. Un correo que no existe se bloquea igual, para que el bloqueo no delate qué correos tienen cuenta. El contador vive en la memoria del proceso, y eso tiene dos consecuencias: con más de una instancia cada una cuenta por su lado, y reiniciar el servidor borra los bloqueos, así que un proceso que se reinicia en bucle recupera presupuesto de intentos. Cualquiera de las dos es motivo para mover el contador a la base.</w:t>
+      </w:r>
+    </w:p>
+    <w:p>
+      <w:pPr/>
+      <w:r>
+        <w:t>Tokens. El enlace lleva 32 bytes de crypto.randomBytes en base64url; la base guarda su SHA-256 en hexadecimal. No hace falta Argon2: un token de 256 bits aleatorios no se adivina por fuerza bruta, a diferencia de una contraseña elegida por una persona. Lo que frena una serie de intentos contra los enlaces es el límite por IP de la ruta que los consume.</w:t>
+      </w:r>
+    </w:p>
+    <w:p>
+      <w:pPr/>
+      <w:r>
+        <w:t>Proxy. trustProxy nunca es true. Con true, Fastify cree cualquier X-Forwarded-For, y si la aplicación es alcanzable sin pasar por el proxy, un cliente escribe la IP que quiera y el límite de intentos por IP deja de existir —no protege menos: no protege nada—. Se configura con PROXIES_DE_CONFIANZA, que acepta solo la dirección o la subred del proxy concreto, y la API rechaza true al arrancar. Sin esa variable, la IP es la de la conexión, y detrás de un proxy todas las peticiones parecerían venir de él: el límite por IP bloquearía a todos los usuarios a la vez. Es lo primero que va a fallar en el primer despliegue.</w:t>
+      </w:r>
+    </w:p>
+    <w:p>
+      <w:pPr/>
+      <w:r>
+        <w:t>Mensajes de error. Los errores que levanta la base llegan con su SQLSTATE y los traduce un solo módulo (§8.4). Los que levanta el propio código son de dos clases: ErrorParaElUsuario, cuyo texto está escrito para la persona —un enlace vencido, un capítulo que no existe— y se muestra tal cual con 404 o 422; y cualquier otro error, que es de programación, responde 500 y nunca muestra su texto. El cuerpo es plano: { mensaje, campo? }, sin sobre envolvente, porque el estado HTTP ya dice que es un error.</w:t>
+      </w:r>
+    </w:p>
+    <w:p>
+      <w:pPr/>
+      <w:r>
+        <w:t>Términos provisionales. Mientras los términos no hayan pasado por un abogado, la versión se llama PROVISIONAL-&lt;fecha&gt; y la API se niega a arrancar con ella salvo que TERMINOS_PROVISIONALES=si esté escrito a mano: olvidarse de configurar algo no arranca. No depende de NODE_ENV. La página sirve el borrador completo de prototipo/legal.html —los cuatro documentos, leídos del archivo y no copiados— y cada documento empieza por un aviso de que el texto no pasó por revisión legal, que la instalación no es para uso real y a quién escribir. El aviso va dentro de cada documento y no en un campo aparte, para que ninguna pantalla pueda mostrar un documento sin él. Así las pantallas se construyen contra el largo real del contenido y el abogado recibe el texto en su contexto. Las firmas contra una versión provisional no se tratan aparte: al publicarse la versión revisada, el registro las ve como versión vieja y pide aceptar de nuevo.</w:t>
+      </w:r>
+    </w:p>
+    <w:p>
+      <w:pPr/>
+      <w:r>
+        <w:t>Y una consecuencia que no es obvia: mientras la API lea ese archivo, prototipo/legal.html deja de ser una maqueta descartable y pasa a ser contenido del que el arranque depende. Borrar la carpeta del prototipo —algo razonable de querer hacer con una maqueta— deja la API sin arrancar. El 4 de octubre de 2026 estuvo a punto de pasar: se iba a reemplazar prototipo/ por un clon más reciente que no tiene legal.html.</w:t>
       </w:r>
     </w:p>
     <w:p>

</xml_diff>